<commit_message>
docs(lab2): complete ADRs and roadmap
</commit_message>
<xml_diff>
--- a/实验二_软件架构设计与微服务拆分/D2-7_架构决策记录ADR集/0001-record-architecture-decisions.docx
+++ b/实验二_软件架构设计与微服务拆分/D2-7_架构决策记录ADR集/0001-record-architecture-decisions.docx
@@ -13,10 +13,13 @@
         <w:gridCol w:w="4873"/>
       </w:tblGrid>
       <w:tr>
+        <w:trPr>
+          <w:tblHeader w:val="true"/>
+        </w:trPr>
         <w:tc>
           <w:tcPr>
             <w:tcW w:type="dxa" w:w="1701"/>
-            <w:shd w:val="clear" w:color="auto" w:fill="EAF4EC"/>
+            <w:shd w:val="clear" w:color="auto" w:fill="EAF6EF"/>
             <w:tcBorders>
               <w:top w:val="single" w:sz="4" w:space="0" w:color="B8D8C2"/>
               <w:left w:val="single" w:sz="4" w:space="0" w:color="B8D8C2"/>
@@ -27,7 +30,7 @@
           </w:tcPr>
           <w:p>
             <w:pPr>
-              <w:spacing w:after="40"/>
+              <w:spacing w:after="20" w:line="259" w:lineRule="auto"/>
               <w:jc w:val="center"/>
             </w:pPr>
             <w:r>
@@ -44,7 +47,7 @@
         <w:tc>
           <w:tcPr>
             <w:tcW w:type="dxa" w:w="7370"/>
-            <w:shd w:val="clear" w:color="auto" w:fill="FFFFFF"/>
+            <w:shd w:val="clear" w:color="auto" w:fill="EAF6EF"/>
             <w:tcBorders>
               <w:top w:val="single" w:sz="4" w:space="0" w:color="D0D7D0"/>
               <w:left w:val="single" w:sz="4" w:space="0" w:color="D0D7D0"/>
@@ -55,7 +58,7 @@
           </w:tcPr>
           <w:p>
             <w:pPr>
-              <w:spacing w:after="40"/>
+              <w:spacing w:after="20" w:line="259" w:lineRule="auto"/>
             </w:pPr>
             <w:r>
               <w:rPr>
@@ -84,7 +87,7 @@
           </w:tcPr>
           <w:p>
             <w:pPr>
-              <w:spacing w:after="40"/>
+              <w:spacing w:after="20" w:line="259" w:lineRule="auto"/>
               <w:jc w:val="center"/>
             </w:pPr>
             <w:r>
@@ -112,7 +115,7 @@
           </w:tcPr>
           <w:p>
             <w:pPr>
-              <w:spacing w:after="40"/>
+              <w:spacing w:after="20" w:line="259" w:lineRule="auto"/>
             </w:pPr>
             <w:r>
               <w:rPr>
@@ -141,7 +144,7 @@
           </w:tcPr>
           <w:p>
             <w:pPr>
-              <w:spacing w:after="40"/>
+              <w:spacing w:after="20" w:line="259" w:lineRule="auto"/>
               <w:jc w:val="center"/>
             </w:pPr>
             <w:r>
@@ -169,7 +172,7 @@
           </w:tcPr>
           <w:p>
             <w:pPr>
-              <w:spacing w:after="40"/>
+              <w:spacing w:after="20" w:line="259" w:lineRule="auto"/>
             </w:pPr>
             <w:r>
               <w:rPr>
@@ -198,7 +201,7 @@
           </w:tcPr>
           <w:p>
             <w:pPr>
-              <w:spacing w:after="40"/>
+              <w:spacing w:after="20" w:line="259" w:lineRule="auto"/>
               <w:jc w:val="center"/>
             </w:pPr>
             <w:r>
@@ -225,7 +228,14 @@
             <w:vAlign w:val="center"/>
           </w:tcPr>
           <w:p>
+            <w:pPr>
+              <w:spacing w:line="259" w:lineRule="auto" w:after="20"/>
+            </w:pPr>
             <w:r>
+              <w:rPr>
+                <w:rFonts w:ascii="Microsoft YaHei" w:hAnsi="Microsoft YaHei" w:eastAsia="Microsoft YaHei"/>
+                <w:sz w:val="18"/>
+              </w:rPr>
               <w:t>戴正宇</w:t>
             </w:r>
           </w:p>
@@ -246,7 +256,7 @@
           </w:tcPr>
           <w:p>
             <w:pPr>
-              <w:spacing w:after="40"/>
+              <w:spacing w:after="20" w:line="259" w:lineRule="auto"/>
               <w:jc w:val="center"/>
             </w:pPr>
             <w:r>
@@ -273,243 +283,608 @@
             <w:vAlign w:val="center"/>
           </w:tcPr>
           <w:p>
+            <w:pPr>
+              <w:spacing w:line="259" w:lineRule="auto" w:after="20"/>
+            </w:pPr>
             <w:r>
+              <w:rPr>
+                <w:rFonts w:ascii="Microsoft YaHei" w:hAnsi="Microsoft YaHei" w:eastAsia="Microsoft YaHei"/>
+                <w:sz w:val="18"/>
+              </w:rPr>
               <w:t>2026-05-14</w:t>
             </w:r>
           </w:p>
         </w:tc>
       </w:tr>
     </w:tbl>
-    <w:p/>
     <w:p>
       <w:pPr>
-        <w:keepNext/>
-        <w:spacing w:before="280" w:after="120"/>
-        <w:pBdr>
-          <w:bottom w:val="single" w:sz="8" w:space="4" w:color="1A7A3D"/>
-        </w:pBdr>
+        <w:spacing w:line="269" w:lineRule="auto" w:after="60"/>
+      </w:pPr>
+    </w:p>
+    <w:p>
+      <w:pPr>
+        <w:spacing w:line="269" w:lineRule="auto" w:after="60"/>
       </w:pPr>
       <w:r>
         <w:rPr>
           <w:rFonts w:ascii="Microsoft YaHei" w:hAnsi="Microsoft YaHei" w:eastAsia="Microsoft YaHei"/>
-          <w:b/>
-          <w:color w:val="1A7A3D"/>
-          <w:sz w:val="36"/>
-        </w:rPr>
-        <w:t>内容大纲</w:t>
-      </w:r>
-    </w:p>
-    <w:p>
-      <w:pPr>
-        <w:spacing w:after="40" w:line="348" w:lineRule="auto"/>
-        <w:ind w:left="340"/>
-      </w:pPr>
-      <w:r>
-        <w:rPr>
-          <w:rFonts w:ascii="Microsoft YaHei" w:hAnsi="Microsoft YaHei" w:eastAsia="Microsoft YaHei"/>
-          <w:b/>
-          <w:color w:val="1A7A3D"/>
           <w:sz w:val="21"/>
         </w:rPr>
-        <w:t xml:space="preserve">• </w:t>
       </w:r>
       <w:r>
         <w:rPr>
           <w:rFonts w:ascii="Microsoft YaHei" w:hAnsi="Microsoft YaHei" w:eastAsia="Microsoft YaHei"/>
-          <w:b w:val="0"/>
-          <w:color w:val="2B2B2B"/>
           <w:sz w:val="21"/>
         </w:rPr>
-        <w:t>Status：Proposed / Accepted / Deprecated / Superseded</w:t>
-      </w:r>
-    </w:p>
-    <w:p>
-      <w:pPr>
-        <w:spacing w:after="40" w:line="348" w:lineRule="auto"/>
-        <w:ind w:left="340"/>
-      </w:pPr>
-      <w:r>
-        <w:rPr>
-          <w:rFonts w:ascii="Microsoft YaHei" w:hAnsi="Microsoft YaHei" w:eastAsia="Microsoft YaHei"/>
-          <w:b/>
-          <w:color w:val="1A7A3D"/>
-          <w:sz w:val="21"/>
-        </w:rPr>
-        <w:t xml:space="preserve">• </w:t>
-      </w:r>
-      <w:r>
-        <w:rPr>
-          <w:rFonts w:ascii="Microsoft YaHei" w:hAnsi="Microsoft YaHei" w:eastAsia="Microsoft YaHei"/>
-          <w:b w:val="0"/>
-          <w:color w:val="2B2B2B"/>
-          <w:sz w:val="21"/>
-        </w:rPr>
-        <w:t>Context：背景、问题陈述、约束</w:t>
-      </w:r>
-    </w:p>
-    <w:p>
-      <w:pPr>
-        <w:spacing w:after="40" w:line="348" w:lineRule="auto"/>
-        <w:ind w:left="340"/>
-      </w:pPr>
-      <w:r>
-        <w:rPr>
-          <w:rFonts w:ascii="Microsoft YaHei" w:hAnsi="Microsoft YaHei" w:eastAsia="Microsoft YaHei"/>
-          <w:b/>
-          <w:color w:val="1A7A3D"/>
-          <w:sz w:val="21"/>
-        </w:rPr>
-        <w:t xml:space="preserve">• </w:t>
-      </w:r>
-      <w:r>
-        <w:rPr>
-          <w:rFonts w:ascii="Microsoft YaHei" w:hAnsi="Microsoft YaHei" w:eastAsia="Microsoft YaHei"/>
-          <w:b w:val="0"/>
-          <w:color w:val="2B2B2B"/>
-          <w:sz w:val="21"/>
-        </w:rPr>
-        <w:t>Decision：决策内容（陈述句，结论先行）</w:t>
-      </w:r>
-    </w:p>
-    <w:p>
-      <w:pPr>
-        <w:spacing w:after="40" w:line="348" w:lineRule="auto"/>
-        <w:ind w:left="340"/>
-      </w:pPr>
-      <w:r>
-        <w:rPr>
-          <w:rFonts w:ascii="Microsoft YaHei" w:hAnsi="Microsoft YaHei" w:eastAsia="Microsoft YaHei"/>
-          <w:b/>
-          <w:color w:val="1A7A3D"/>
-          <w:sz w:val="21"/>
-        </w:rPr>
-        <w:t xml:space="preserve">• </w:t>
-      </w:r>
-      <w:r>
-        <w:rPr>
-          <w:rFonts w:ascii="Microsoft YaHei" w:hAnsi="Microsoft YaHei" w:eastAsia="Microsoft YaHei"/>
-          <w:b w:val="0"/>
-          <w:color w:val="2B2B2B"/>
-          <w:sz w:val="21"/>
-        </w:rPr>
-        <w:t>Consequences：正面影响 + 负面影响 + 中性影响</w:t>
-      </w:r>
-    </w:p>
-    <w:p>
-      <w:pPr>
-        <w:spacing w:after="40" w:line="348" w:lineRule="auto"/>
-        <w:ind w:left="340"/>
-      </w:pPr>
-      <w:r>
-        <w:rPr>
-          <w:rFonts w:ascii="Microsoft YaHei" w:hAnsi="Microsoft YaHei" w:eastAsia="Microsoft YaHei"/>
-          <w:b/>
-          <w:color w:val="1A7A3D"/>
-          <w:sz w:val="21"/>
-        </w:rPr>
-        <w:t xml:space="preserve">• </w:t>
-      </w:r>
-      <w:r>
-        <w:rPr>
-          <w:rFonts w:ascii="Microsoft YaHei" w:hAnsi="Microsoft YaHei" w:eastAsia="Microsoft YaHei"/>
-          <w:b w:val="0"/>
-          <w:color w:val="2B2B2B"/>
-          <w:sz w:val="21"/>
-        </w:rPr>
-        <w:t>Alternatives Considered：被放弃的替代方案及放弃理由</w:t>
-      </w:r>
-    </w:p>
-    <w:p>
-      <w:pPr>
-        <w:spacing w:after="40" w:line="348" w:lineRule="auto"/>
-        <w:ind w:left="340"/>
-      </w:pPr>
-      <w:r>
-        <w:rPr>
-          <w:rFonts w:ascii="Microsoft YaHei" w:hAnsi="Microsoft YaHei" w:eastAsia="Microsoft YaHei"/>
-          <w:b/>
-          <w:color w:val="1A7A3D"/>
-          <w:sz w:val="21"/>
-        </w:rPr>
-        <w:t xml:space="preserve">• </w:t>
-      </w:r>
-      <w:r>
-        <w:rPr>
-          <w:rFonts w:ascii="Microsoft YaHei" w:hAnsi="Microsoft YaHei" w:eastAsia="Microsoft YaHei"/>
-          <w:b w:val="0"/>
-          <w:color w:val="2B2B2B"/>
-          <w:sz w:val="21"/>
-        </w:rPr>
-        <w:t>References：参考资料、相关 ADR</w:t>
+        <w:t>ADR 正文</w:t>
       </w:r>
     </w:p>
     <w:tbl>
       <w:tblPr>
+        <w:tblStyle w:val="TableGrid"/>
         <w:tblW w:type="auto" w:w="0"/>
         <w:jc w:val="center"/>
         <w:tblLook w:firstColumn="1" w:firstRow="1" w:lastColumn="0" w:lastRow="0" w:noHBand="0" w:noVBand="1" w:val="04A0"/>
       </w:tblPr>
       <w:tblGrid>
-        <w:gridCol w:w="9746"/>
+        <w:gridCol w:w="4873"/>
+        <w:gridCol w:w="4873"/>
       </w:tblGrid>
+      <w:tr>
+        <w:trPr>
+          <w:tblHeader w:val="true"/>
+        </w:trPr>
+        <w:tc>
+          <w:tcPr>
+            <w:tcW w:type="dxa" w:w="4873"/>
+            <w:vAlign w:val="center"/>
+            <w:shd w:fill="EAF6EF"/>
+          </w:tcPr>
+          <w:p>
+            <w:pPr>
+              <w:spacing w:line="259" w:lineRule="auto" w:after="20"/>
+              <w:jc w:val="left"/>
+            </w:pPr>
+            <w:r>
+              <w:rPr>
+                <w:rFonts w:ascii="Microsoft YaHei" w:hAnsi="Microsoft YaHei" w:eastAsia="Microsoft YaHei"/>
+                <w:sz w:val="18"/>
+              </w:rPr>
+            </w:r>
+            <w:r>
+              <w:rPr>
+                <w:rFonts w:ascii="Microsoft YaHei" w:hAnsi="Microsoft YaHei" w:eastAsia="Microsoft YaHei"/>
+                <w:b/>
+                <w:color w:val="096841"/>
+                <w:sz w:val="18"/>
+              </w:rPr>
+              <w:t>字段</w:t>
+            </w:r>
+          </w:p>
+        </w:tc>
+        <w:tc>
+          <w:tcPr>
+            <w:tcW w:type="dxa" w:w="4873"/>
+            <w:vAlign w:val="center"/>
+            <w:shd w:fill="EAF6EF"/>
+          </w:tcPr>
+          <w:p>
+            <w:pPr>
+              <w:spacing w:line="259" w:lineRule="auto" w:after="20"/>
+              <w:jc w:val="left"/>
+            </w:pPr>
+            <w:r>
+              <w:rPr>
+                <w:rFonts w:ascii="Microsoft YaHei" w:hAnsi="Microsoft YaHei" w:eastAsia="Microsoft YaHei"/>
+                <w:sz w:val="18"/>
+              </w:rPr>
+            </w:r>
+            <w:r>
+              <w:rPr>
+                <w:rFonts w:ascii="Microsoft YaHei" w:hAnsi="Microsoft YaHei" w:eastAsia="Microsoft YaHei"/>
+                <w:b/>
+                <w:color w:val="096841"/>
+                <w:sz w:val="18"/>
+              </w:rPr>
+              <w:t>内容</w:t>
+            </w:r>
+          </w:p>
+        </w:tc>
+      </w:tr>
       <w:tr>
         <w:tc>
           <w:tcPr>
-            <w:tcW w:type="dxa" w:w="9746"/>
-            <w:shd w:val="clear" w:color="auto" w:fill="FBFDFB"/>
-            <w:tcBorders>
-              <w:top w:val="single" w:sz="4" w:space="0" w:color="B8D8C2"/>
-              <w:left w:val="single" w:sz="4" w:space="0" w:color="B8D8C2"/>
-              <w:bottom w:val="single" w:sz="4" w:space="0" w:color="B8D8C2"/>
-              <w:right w:val="single" w:sz="4" w:space="0" w:color="B8D8C2"/>
-            </w:tcBorders>
-            <w:vAlign w:val="top"/>
+            <w:tcW w:type="dxa" w:w="4873"/>
+            <w:vAlign w:val="center"/>
           </w:tcPr>
           <w:p>
+            <w:pPr>
+              <w:spacing w:line="259" w:lineRule="auto" w:after="20"/>
+              <w:jc w:val="left"/>
+            </w:pPr>
             <w:r>
-              <w:t># 0001 确立 ADR 制度</w:t>
+              <w:rPr>
+                <w:rFonts w:ascii="Microsoft YaHei" w:hAnsi="Microsoft YaHei" w:eastAsia="Microsoft YaHei"/>
+                <w:sz w:val="18"/>
+              </w:rPr>
+            </w:r>
+            <w:r>
+              <w:rPr>
+                <w:rFonts w:ascii="Microsoft YaHei" w:hAnsi="Microsoft YaHei" w:eastAsia="Microsoft YaHei"/>
+                <w:b w:val="0"/>
+                <w:sz w:val="18"/>
+              </w:rPr>
+              <w:t>Title</w:t>
             </w:r>
           </w:p>
-          <w:p/>
+        </w:tc>
+        <w:tc>
+          <w:tcPr>
+            <w:tcW w:type="dxa" w:w="4873"/>
+            <w:vAlign w:val="center"/>
+          </w:tcPr>
           <w:p>
+            <w:pPr>
+              <w:spacing w:line="259" w:lineRule="auto" w:after="20"/>
+              <w:jc w:val="left"/>
+            </w:pPr>
             <w:r>
-              <w:t>Status: Accepted</w:t>
+              <w:rPr>
+                <w:rFonts w:ascii="Microsoft YaHei" w:hAnsi="Microsoft YaHei" w:eastAsia="Microsoft YaHei"/>
+                <w:sz w:val="18"/>
+              </w:rPr>
+            </w:r>
+            <w:r>
+              <w:rPr>
+                <w:rFonts w:ascii="Microsoft YaHei" w:hAnsi="Microsoft YaHei" w:eastAsia="Microsoft YaHei"/>
+                <w:b w:val="0"/>
+                <w:sz w:val="18"/>
+              </w:rPr>
+              <w:t>0001 确立 ADR 制度</w:t>
             </w:r>
           </w:p>
-          <w:p/>
+        </w:tc>
+      </w:tr>
+      <w:tr>
+        <w:tc>
+          <w:tcPr>
+            <w:tcW w:type="dxa" w:w="4873"/>
+            <w:vAlign w:val="center"/>
+          </w:tcPr>
           <w:p>
+            <w:pPr>
+              <w:spacing w:line="259" w:lineRule="auto" w:after="20"/>
+              <w:jc w:val="left"/>
+            </w:pPr>
             <w:r>
-              <w:t>Context: NekoCafé 架构需要回答服务拆分、数据库、消息、API、鉴权和跨境数据等长期影响问题。若只在报告中给出结论，后续实验和迭代无法知道当时的约束与取舍。</w:t>
+              <w:rPr>
+                <w:rFonts w:ascii="Microsoft YaHei" w:hAnsi="Microsoft YaHei" w:eastAsia="Microsoft YaHei"/>
+                <w:sz w:val="18"/>
+              </w:rPr>
+            </w:r>
+            <w:r>
+              <w:rPr>
+                <w:rFonts w:ascii="Microsoft YaHei" w:hAnsi="Microsoft YaHei" w:eastAsia="Microsoft YaHei"/>
+                <w:b w:val="0"/>
+                <w:sz w:val="18"/>
+              </w:rPr>
+              <w:t>Status / Date / Owner</w:t>
             </w:r>
           </w:p>
-          <w:p/>
+        </w:tc>
+        <w:tc>
+          <w:tcPr>
+            <w:tcW w:type="dxa" w:w="4873"/>
+            <w:vAlign w:val="center"/>
+          </w:tcPr>
           <w:p>
+            <w:pPr>
+              <w:spacing w:line="259" w:lineRule="auto" w:after="20"/>
+              <w:jc w:val="left"/>
+            </w:pPr>
             <w:r>
-              <w:t>Decision: 项目采用 ADR 记录所有重要架构决策。ADR 从 0001 起递增编号，状态使用 Proposed、Accepted、Deprecated、Superseded。每份 ADR 必须包含 Context、Decision、Consequences、Alternatives Considered、References，并在 Git 仓库 docs/adr/ 中托管。</w:t>
+              <w:rPr>
+                <w:rFonts w:ascii="Microsoft YaHei" w:hAnsi="Microsoft YaHei" w:eastAsia="Microsoft YaHei"/>
+                <w:sz w:val="18"/>
+              </w:rPr>
+            </w:r>
+            <w:r>
+              <w:rPr>
+                <w:rFonts w:ascii="Microsoft YaHei" w:hAnsi="Microsoft YaHei" w:eastAsia="Microsoft YaHei"/>
+                <w:b w:val="0"/>
+                <w:sz w:val="18"/>
+              </w:rPr>
+              <w:t>Accepted；2026-05-14；架构负责人 / 实验二小组</w:t>
             </w:r>
           </w:p>
-          <w:p/>
+        </w:tc>
+      </w:tr>
+      <w:tr>
+        <w:tc>
+          <w:tcPr>
+            <w:tcW w:type="dxa" w:w="4873"/>
+            <w:vAlign w:val="center"/>
+          </w:tcPr>
           <w:p>
+            <w:pPr>
+              <w:spacing w:line="259" w:lineRule="auto" w:after="20"/>
+              <w:jc w:val="left"/>
+            </w:pPr>
             <w:r>
-              <w:t>Consequences: 正面影响是决策可追溯、便于评审和答辩；负面影响是需要额外维护；中性影响是 ADR 不替代 C4、OpenAPI 和代码，只记录为什么这样设计。</w:t>
+              <w:rPr>
+                <w:rFonts w:ascii="Microsoft YaHei" w:hAnsi="Microsoft YaHei" w:eastAsia="Microsoft YaHei"/>
+                <w:sz w:val="18"/>
+              </w:rPr>
+            </w:r>
+            <w:r>
+              <w:rPr>
+                <w:rFonts w:ascii="Microsoft YaHei" w:hAnsi="Microsoft YaHei" w:eastAsia="Microsoft YaHei"/>
+                <w:b w:val="0"/>
+                <w:sz w:val="18"/>
+              </w:rPr>
+              <w:t>Context</w:t>
             </w:r>
           </w:p>
-          <w:p/>
+        </w:tc>
+        <w:tc>
+          <w:tcPr>
+            <w:tcW w:type="dxa" w:w="4873"/>
+            <w:vAlign w:val="center"/>
+          </w:tcPr>
           <w:p>
+            <w:pPr>
+              <w:spacing w:line="259" w:lineRule="auto" w:after="20"/>
+              <w:jc w:val="left"/>
+            </w:pPr>
             <w:r>
-              <w:t>Alternatives Considered: 仅在实验报告中描述，被放弃，因为无法按时间演进；只在 Issue 中讨论，被放弃，因为结构不稳定。</w:t>
+              <w:rPr>
+                <w:rFonts w:ascii="Microsoft YaHei" w:hAnsi="Microsoft YaHei" w:eastAsia="Microsoft YaHei"/>
+                <w:sz w:val="18"/>
+              </w:rPr>
+            </w:r>
+            <w:r>
+              <w:rPr>
+                <w:rFonts w:ascii="Microsoft YaHei" w:hAnsi="Microsoft YaHei" w:eastAsia="Microsoft YaHei"/>
+                <w:b w:val="0"/>
+                <w:sz w:val="18"/>
+              </w:rPr>
+              <w:t>NekoCafé 架构涉及服务拆分、数据库、消息、API、鉴权、跨境数据等长期影响问题。若只在报告中写结论，后续实验、答辩和迭代无法追溯“为什么这样设计”。课程交付还要求 C4、OpenAPI、数据字典和 ATAM 结论之间保持一致。</w:t>
             </w:r>
           </w:p>
-          <w:p/>
+        </w:tc>
+      </w:tr>
+      <w:tr>
+        <w:tc>
+          <w:tcPr>
+            <w:tcW w:type="dxa" w:w="4873"/>
+            <w:vAlign w:val="center"/>
+          </w:tcPr>
           <w:p>
+            <w:pPr>
+              <w:spacing w:line="259" w:lineRule="auto" w:after="20"/>
+              <w:jc w:val="left"/>
+            </w:pPr>
             <w:r>
-              <w:t>References: 实验二任务书；Michael Nygard, Documenting Architecture Decisions.</w:t>
+              <w:rPr>
+                <w:rFonts w:ascii="Microsoft YaHei" w:hAnsi="Microsoft YaHei" w:eastAsia="Microsoft YaHei"/>
+                <w:sz w:val="18"/>
+              </w:rPr>
+            </w:r>
+            <w:r>
+              <w:rPr>
+                <w:rFonts w:ascii="Microsoft YaHei" w:hAnsi="Microsoft YaHei" w:eastAsia="Microsoft YaHei"/>
+                <w:b w:val="0"/>
+                <w:sz w:val="18"/>
+              </w:rPr>
+              <w:t>Decision</w:t>
+            </w:r>
+          </w:p>
+        </w:tc>
+        <w:tc>
+          <w:tcPr>
+            <w:tcW w:type="dxa" w:w="4873"/>
+            <w:vAlign w:val="center"/>
+          </w:tcPr>
+          <w:p>
+            <w:pPr>
+              <w:spacing w:line="259" w:lineRule="auto" w:after="20"/>
+              <w:jc w:val="left"/>
+            </w:pPr>
+            <w:r>
+              <w:rPr>
+                <w:rFonts w:ascii="Microsoft YaHei" w:hAnsi="Microsoft YaHei" w:eastAsia="Microsoft YaHei"/>
+                <w:sz w:val="18"/>
+              </w:rPr>
+            </w:r>
+            <w:r>
+              <w:rPr>
+                <w:rFonts w:ascii="Microsoft YaHei" w:hAnsi="Microsoft YaHei" w:eastAsia="Microsoft YaHei"/>
+                <w:b w:val="0"/>
+                <w:sz w:val="18"/>
+              </w:rPr>
+              <w:t>采用 MADR 风格记录架构决策。所有影响服务边界、数据边界、接口契约、质量属性或合规要求的决策必须新增 ADR；ADR 按 0001 起递增编号，不重排历史编号；状态只允许 Proposed、Accepted、Deprecated、Superseded。</w:t>
+            </w:r>
+          </w:p>
+        </w:tc>
+      </w:tr>
+      <w:tr>
+        <w:tc>
+          <w:tcPr>
+            <w:tcW w:type="dxa" w:w="4873"/>
+            <w:vAlign w:val="center"/>
+          </w:tcPr>
+          <w:p>
+            <w:pPr>
+              <w:spacing w:line="259" w:lineRule="auto" w:after="20"/>
+              <w:jc w:val="left"/>
+            </w:pPr>
+            <w:r>
+              <w:rPr>
+                <w:rFonts w:ascii="Microsoft YaHei" w:hAnsi="Microsoft YaHei" w:eastAsia="Microsoft YaHei"/>
+                <w:sz w:val="18"/>
+              </w:rPr>
+            </w:r>
+            <w:r>
+              <w:rPr>
+                <w:rFonts w:ascii="Microsoft YaHei" w:hAnsi="Microsoft YaHei" w:eastAsia="Microsoft YaHei"/>
+                <w:b w:val="0"/>
+                <w:sz w:val="18"/>
+              </w:rPr>
+              <w:t>Consequences</w:t>
+            </w:r>
+          </w:p>
+        </w:tc>
+        <w:tc>
+          <w:tcPr>
+            <w:tcW w:type="dxa" w:w="4873"/>
+            <w:vAlign w:val="center"/>
+          </w:tcPr>
+          <w:p>
+            <w:pPr>
+              <w:spacing w:line="259" w:lineRule="auto" w:after="20"/>
+              <w:jc w:val="left"/>
+            </w:pPr>
+            <w:r>
+              <w:rPr>
+                <w:rFonts w:ascii="Microsoft YaHei" w:hAnsi="Microsoft YaHei" w:eastAsia="Microsoft YaHei"/>
+                <w:sz w:val="18"/>
+              </w:rPr>
+            </w:r>
+            <w:r>
+              <w:rPr>
+                <w:rFonts w:ascii="Microsoft YaHei" w:hAnsi="Microsoft YaHei" w:eastAsia="Microsoft YaHei"/>
+                <w:b w:val="0"/>
+                <w:sz w:val="18"/>
+              </w:rPr>
+              <w:t>正面：决策理由可追溯，便于评审、答辩和后续实验复用。</w:t>
+            </w:r>
+            <w:r>
+              <w:rPr>
+                <w:rFonts w:ascii="Microsoft YaHei" w:hAnsi="Microsoft YaHei" w:eastAsia="Microsoft YaHei"/>
+                <w:sz w:val="18"/>
+              </w:rPr>
+              <w:br/>
+            </w:r>
+            <w:r>
+              <w:rPr>
+                <w:rFonts w:ascii="Microsoft YaHei" w:hAnsi="Microsoft YaHei" w:eastAsia="Microsoft YaHei"/>
+                <w:b w:val="0"/>
+                <w:sz w:val="18"/>
+              </w:rPr>
+              <w:t>负面：需要额外维护，ADR 与 C4/OpenAPI 不一致时必须同步修订。</w:t>
+            </w:r>
+            <w:r>
+              <w:rPr>
+                <w:rFonts w:ascii="Microsoft YaHei" w:hAnsi="Microsoft YaHei" w:eastAsia="Microsoft YaHei"/>
+                <w:sz w:val="18"/>
+              </w:rPr>
+              <w:br/>
+            </w:r>
+            <w:r>
+              <w:rPr>
+                <w:rFonts w:ascii="Microsoft YaHei" w:hAnsi="Microsoft YaHei" w:eastAsia="Microsoft YaHei"/>
+                <w:b w:val="0"/>
+                <w:sz w:val="18"/>
+              </w:rPr>
+              <w:t>中性：ADR 不替代设计文档，只记录关键取舍和约束。</w:t>
+            </w:r>
+          </w:p>
+        </w:tc>
+      </w:tr>
+      <w:tr>
+        <w:tc>
+          <w:tcPr>
+            <w:tcW w:type="dxa" w:w="4873"/>
+            <w:vAlign w:val="center"/>
+          </w:tcPr>
+          <w:p>
+            <w:pPr>
+              <w:spacing w:line="259" w:lineRule="auto" w:after="20"/>
+              <w:jc w:val="left"/>
+            </w:pPr>
+            <w:r>
+              <w:rPr>
+                <w:rFonts w:ascii="Microsoft YaHei" w:hAnsi="Microsoft YaHei" w:eastAsia="Microsoft YaHei"/>
+                <w:sz w:val="18"/>
+              </w:rPr>
+            </w:r>
+            <w:r>
+              <w:rPr>
+                <w:rFonts w:ascii="Microsoft YaHei" w:hAnsi="Microsoft YaHei" w:eastAsia="Microsoft YaHei"/>
+                <w:b w:val="0"/>
+                <w:sz w:val="18"/>
+              </w:rPr>
+              <w:t>Alternatives Considered</w:t>
+            </w:r>
+          </w:p>
+        </w:tc>
+        <w:tc>
+          <w:tcPr>
+            <w:tcW w:type="dxa" w:w="4873"/>
+            <w:vAlign w:val="center"/>
+          </w:tcPr>
+          <w:p>
+            <w:pPr>
+              <w:spacing w:line="259" w:lineRule="auto" w:after="20"/>
+              <w:jc w:val="left"/>
+            </w:pPr>
+            <w:r>
+              <w:rPr>
+                <w:rFonts w:ascii="Microsoft YaHei" w:hAnsi="Microsoft YaHei" w:eastAsia="Microsoft YaHei"/>
+                <w:sz w:val="18"/>
+              </w:rPr>
+            </w:r>
+            <w:r>
+              <w:rPr>
+                <w:rFonts w:ascii="Microsoft YaHei" w:hAnsi="Microsoft YaHei" w:eastAsia="Microsoft YaHei"/>
+                <w:b w:val="0"/>
+                <w:sz w:val="18"/>
+              </w:rPr>
+              <w:t>只在实验报告中描述：放弃，因为结论分散且难追踪。</w:t>
+            </w:r>
+            <w:r>
+              <w:rPr>
+                <w:rFonts w:ascii="Microsoft YaHei" w:hAnsi="Microsoft YaHei" w:eastAsia="Microsoft YaHei"/>
+                <w:sz w:val="18"/>
+              </w:rPr>
+              <w:br/>
+            </w:r>
+            <w:r>
+              <w:rPr>
+                <w:rFonts w:ascii="Microsoft YaHei" w:hAnsi="Microsoft YaHei" w:eastAsia="Microsoft YaHei"/>
+                <w:b w:val="0"/>
+                <w:sz w:val="18"/>
+              </w:rPr>
+              <w:t>使用大型架构章程：放弃，因为课程规模下维护成本过高。</w:t>
+            </w:r>
+            <w:r>
+              <w:rPr>
+                <w:rFonts w:ascii="Microsoft YaHei" w:hAnsi="Microsoft YaHei" w:eastAsia="Microsoft YaHei"/>
+                <w:sz w:val="18"/>
+              </w:rPr>
+              <w:br/>
+            </w:r>
+            <w:r>
+              <w:rPr>
+                <w:rFonts w:ascii="Microsoft YaHei" w:hAnsi="Microsoft YaHei" w:eastAsia="Microsoft YaHei"/>
+                <w:b w:val="0"/>
+                <w:sz w:val="18"/>
+              </w:rPr>
+              <w:t>代码注释记录决策：放弃，因为业务与架构取舍不应埋在实现细节中。</w:t>
+            </w:r>
+          </w:p>
+        </w:tc>
+      </w:tr>
+      <w:tr>
+        <w:tc>
+          <w:tcPr>
+            <w:tcW w:type="dxa" w:w="4873"/>
+            <w:vAlign w:val="center"/>
+          </w:tcPr>
+          <w:p>
+            <w:pPr>
+              <w:spacing w:line="259" w:lineRule="auto" w:after="20"/>
+              <w:jc w:val="left"/>
+            </w:pPr>
+            <w:r>
+              <w:rPr>
+                <w:rFonts w:ascii="Microsoft YaHei" w:hAnsi="Microsoft YaHei" w:eastAsia="Microsoft YaHei"/>
+                <w:sz w:val="18"/>
+              </w:rPr>
+            </w:r>
+            <w:r>
+              <w:rPr>
+                <w:rFonts w:ascii="Microsoft YaHei" w:hAnsi="Microsoft YaHei" w:eastAsia="Microsoft YaHei"/>
+                <w:b w:val="0"/>
+                <w:sz w:val="18"/>
+              </w:rPr>
+              <w:t>Implementation Notes</w:t>
+            </w:r>
+          </w:p>
+        </w:tc>
+        <w:tc>
+          <w:tcPr>
+            <w:tcW w:type="dxa" w:w="4873"/>
+            <w:vAlign w:val="center"/>
+          </w:tcPr>
+          <w:p>
+            <w:pPr>
+              <w:spacing w:line="259" w:lineRule="auto" w:after="20"/>
+              <w:jc w:val="left"/>
+            </w:pPr>
+            <w:r>
+              <w:rPr>
+                <w:rFonts w:ascii="Microsoft YaHei" w:hAnsi="Microsoft YaHei" w:eastAsia="Microsoft YaHei"/>
+                <w:sz w:val="18"/>
+              </w:rPr>
+            </w:r>
+            <w:r>
+              <w:rPr>
+                <w:rFonts w:ascii="Microsoft YaHei" w:hAnsi="Microsoft YaHei" w:eastAsia="Microsoft YaHei"/>
+                <w:b w:val="0"/>
+                <w:sz w:val="18"/>
+              </w:rPr>
+              <w:t>每个里程碑结束进行 ADR 回顾；变更 C4、OpenAPI、数据字典或路线图时检查是否需要新增或更新 ADR；被替代的 ADR 保留原文并标记 Superseded。</w:t>
+            </w:r>
+          </w:p>
+        </w:tc>
+      </w:tr>
+      <w:tr>
+        <w:tc>
+          <w:tcPr>
+            <w:tcW w:type="dxa" w:w="4873"/>
+            <w:vAlign w:val="center"/>
+          </w:tcPr>
+          <w:p>
+            <w:pPr>
+              <w:spacing w:line="259" w:lineRule="auto" w:after="20"/>
+              <w:jc w:val="left"/>
+            </w:pPr>
+            <w:r>
+              <w:rPr>
+                <w:rFonts w:ascii="Microsoft YaHei" w:hAnsi="Microsoft YaHei" w:eastAsia="Microsoft YaHei"/>
+                <w:sz w:val="18"/>
+              </w:rPr>
+            </w:r>
+            <w:r>
+              <w:rPr>
+                <w:rFonts w:ascii="Microsoft YaHei" w:hAnsi="Microsoft YaHei" w:eastAsia="Microsoft YaHei"/>
+                <w:b w:val="0"/>
+                <w:sz w:val="18"/>
+              </w:rPr>
+              <w:t>References</w:t>
+            </w:r>
+          </w:p>
+        </w:tc>
+        <w:tc>
+          <w:tcPr>
+            <w:tcW w:type="dxa" w:w="4873"/>
+            <w:vAlign w:val="center"/>
+          </w:tcPr>
+          <w:p>
+            <w:pPr>
+              <w:spacing w:line="259" w:lineRule="auto" w:after="20"/>
+              <w:jc w:val="left"/>
+            </w:pPr>
+            <w:r>
+              <w:rPr>
+                <w:rFonts w:ascii="Microsoft YaHei" w:hAnsi="Microsoft YaHei" w:eastAsia="Microsoft YaHei"/>
+                <w:sz w:val="18"/>
+              </w:rPr>
+            </w:r>
+            <w:r>
+              <w:rPr>
+                <w:rFonts w:ascii="Microsoft YaHei" w:hAnsi="Microsoft YaHei" w:eastAsia="Microsoft YaHei"/>
+                <w:b w:val="0"/>
+                <w:sz w:val="18"/>
+              </w:rPr>
+              <w:t>D2-3 ATAM 报告；D2-4 C4 图集；D2-8 架构演进路线图。</w:t>
             </w:r>
           </w:p>
         </w:tc>
       </w:tr>
     </w:tbl>
-    <w:p/>
     <w:sectPr>
       <w:pgSz w:w="12240" w:h="15840"/>
       <w:pgMar w:top="1134" w:right="1247" w:bottom="1134" w:left="1247" w:header="720" w:footer="720" w:gutter="0"/>

</xml_diff>